<commit_message>
docs: registrar publicacion, migracion y respaldo verificados
</commit_message>
<xml_diff>
--- a/docs/presentacion/Guia-Operacion-y-Exposicion.docx
+++ b/docs/presentacion/Guia-Operacion-y-Exposicion.docx
@@ -331,7 +331,7 @@
     </w:p>
     <w:p>
       <w:r>
-        <w:t>La copia local contiene las correcciones de esta revisión. El dominio comprobado es https://sky-import-jet.vercel.app. La base conectada todavía requiere la migración de integridad de pedidos y cupones; la publicación también necesita recibir las correcciones locales y pasar la verificación posterior.</w:t>
+        <w:t>Las correcciones se publicaron el 19/10/2026 en https://sky-import-jet.vercel.app. La base tiene aplicada la migración de integridad de pedidos y cupones. Antes del cambio se restauró una copia lógica en una base local aislada; el ciclo de reserva y cancelación se comprobó también en producción con reversión de la prueba.</w:t>
       </w:r>
     </w:p>
     <w:p>
@@ -1900,7 +1900,7 @@
     </w:p>
     <w:p>
       <w:r>
-        <w:t>Cobro electrónico, factura fiscal, seguimiento de transporte, cuentas de compradores y bitácora completa de operaciones. Los tiempos de respuesta, la disponibilidad sostenida y la restauración de respaldos requieren evidencia operativa específica. Presentar esos puntos como límites, sin confundirlos con funciones ya terminadas.</w:t>
+        <w:t>Cobro electrónico, factura fiscal, seguimiento de transporte, cuentas de compradores y bitácora completa de operaciones. Los tiempos de respuesta y la disponibilidad sostenida requieren mediciones específicas. La restauración de datos está probada localmente; faltan copias diarias y externas y una recuperación integral del servicio.</w:t>
       </w:r>
     </w:p>
     <w:p>
@@ -1927,22 +1927,22 @@
     </w:p>
     <w:p>
       <w:r>
-        <w:t>1. Comprobar que la revisión se publica en sky-import-jet.vercel.app y utiliza el proyecto Supabase bhlkdinovdhtwxkkujic. El traspaso de titularidad ya realizado es independiente de la publicación de estas correcciones.</w:t>
+        <w:t>1. Publicación comprobada el 19/10/2026: sky-import-jet.vercel.app, en Vercel de Ciendel, conectado al proyecto Supabase bhlkdinovdhtwxkkujic.</w:t>
       </w:r>
     </w:p>
     <w:p>
       <w:r>
-        <w:t>2. Obtener una copia de seguridad antes de cambiar la base. Aplicar únicamente las migraciones pendientes, incluida 20261019141606_integridad_pedidos_cupones.sql. No ejecutar versiones antiguas de funciones sobre una base actualizada.</w:t>
+        <w:t>2. La migración 20261019141606_integridad_pedidos_cupones.sql está aplicada y registrada. Antes se guardó y restauró una copia lógica. No volver a ejecutar versiones antiguas de funciones.</w:t>
       </w:r>
     </w:p>
     <w:p>
       <w:r>
-        <w:t>3. Desplegar la revisión con las variables del entorno correcto. Verificar catálogo, login, permisos, pedido de prueba, cancelación y stock. Confirmar las URL canónicas y el desplazamiento por teclado en móvil.</w:t>
+        <w:t>3. Verificación posterior: 10 pruebas de navegador correctas entre escritorio y móvil; panel, permisos, accesibilidad y URL canónicas. Los rechazos comerciales del checkout se simularon; el ciclo de stock se probó por SQL en producción con reversión.</w:t>
       </w:r>
     </w:p>
     <w:p>
       <w:r>
-        <w:t>4. Registrar fecha, versión publicada, migraciones y resultados. El hecho de que la portada responda HTTP 200 no demuestra el funcionamiento del registro de pedidos.</w:t>
+        <w:t>4. Resultado final de los datos: 37 productos, cero pedidos y cero cuentas temporales de prueba. En futuros cambios, conservar fecha, versión y resultados y repetir el recorrido afectado.</w:t>
       </w:r>
     </w:p>
     <w:p>
@@ -1955,12 +1955,12 @@
     </w:p>
     <w:p>
       <w:r>
-        <w:t>Procedimiento propuesto: el titular designa un responsable que conserva copias de la base en un almacenamiento privado, separado del proyecto y con acceso limitado. La copia debe incluir esquema y datos; los archivos de Storage, si se usan, y las identidades de Auth requieren revisar su cobertura por separado.</w:t>
+        <w:t>Ejecución del 19/10/2026: copia privada previa a la migración, fuera del repositorio, con SQL de reconstrucción, informe y sumas SHA-256. Se restauraron nueve tablas públicas y los registros de dos tablas de Auth; todos coincidieron. También se reconstruyeron 17 políticas RLS y se aplicó la migración sobre la copia.</w:t>
       </w:r>
     </w:p>
     <w:p>
       <w:r>
-        <w:t>Restaurar primero en un entorno de prueba. Comprobar cantidades de registros, relaciones entre pedidos y líneas, permisos y autenticación. Registrar fecha, duración y resultado. Un archivo exportado sin prueba de restauración no acredita capacidad de recuperación. El objetivo del SRS es una copia diaria; su ejecución periódica todavía debe configurarse y verificarse.</w:t>
+        <w:t>Alcance: no incluye sesiones, tokens de renovación, MFA, configuración de proveedores ni secretos del despliegue. Storage estaba vacío. La prueba no reconstruye todo el servicio Supabase. El plan Free no ofrece copias administradas: el titular debe conservar una copia externa privada y organizar la frecuencia diaria. La ubicación y el procedimiento están en README; nunca adjuntar los datos de Auth al documento académico.</w:t>
       </w:r>
     </w:p>
     <w:p>
@@ -2309,31 +2309,31 @@
       </w:rPr>
     </w:lvl>
   </w:abstractNum>
-  <w:num w:numId="1" w16cid:durableId="309601793">
+  <w:num w:numId="1" w16cid:durableId="807481348">
     <w:abstractNumId w:val="8"/>
   </w:num>
-  <w:num w:numId="2" w16cid:durableId="14621319">
+  <w:num w:numId="2" w16cid:durableId="1530219158">
     <w:abstractNumId w:val="6"/>
   </w:num>
-  <w:num w:numId="3" w16cid:durableId="484444012">
+  <w:num w:numId="3" w16cid:durableId="1842349345">
     <w:abstractNumId w:val="5"/>
   </w:num>
-  <w:num w:numId="4" w16cid:durableId="2118133955">
+  <w:num w:numId="4" w16cid:durableId="1392848420">
     <w:abstractNumId w:val="4"/>
   </w:num>
-  <w:num w:numId="5" w16cid:durableId="956526031">
+  <w:num w:numId="5" w16cid:durableId="264580025">
     <w:abstractNumId w:val="7"/>
   </w:num>
-  <w:num w:numId="6" w16cid:durableId="103572625">
+  <w:num w:numId="6" w16cid:durableId="1517424863">
     <w:abstractNumId w:val="3"/>
   </w:num>
-  <w:num w:numId="7" w16cid:durableId="1384794366">
+  <w:num w:numId="7" w16cid:durableId="589193662">
     <w:abstractNumId w:val="2"/>
   </w:num>
-  <w:num w:numId="8" w16cid:durableId="205602675">
+  <w:num w:numId="8" w16cid:durableId="2069066666">
     <w:abstractNumId w:val="1"/>
   </w:num>
-  <w:num w:numId="9" w16cid:durableId="197158678">
+  <w:num w:numId="9" w16cid:durableId="229190801">
     <w:abstractNumId w:val="0"/>
   </w:num>
 </w:numbering>

</xml_diff>

<commit_message>
fix: actualizar dependencias y verificar respaldo y compra en CI
</commit_message>
<xml_diff>
--- a/docs/presentacion/Guia-Operacion-y-Exposicion.docx
+++ b/docs/presentacion/Guia-Operacion-y-Exposicion.docx
@@ -1900,7 +1900,7 @@
     </w:p>
     <w:p>
       <w:r>
-        <w:t>Cobro electrónico, factura fiscal, seguimiento de transporte, cuentas de compradores y bitácora completa de operaciones. Los tiempos de respuesta y la disponibilidad sostenida requieren mediciones específicas. La restauración de datos está probada localmente; faltan copias diarias y externas y una recuperación integral del servicio.</w:t>
+        <w:t>Cobro electrónico, factura fiscal, seguimiento de transporte, cuentas de compradores y bitácora completa de operaciones. Los tiempos de respuesta y la disponibilidad requieren mediciones. La restauración de datos está probada y la tarea diaria está programada; faltan comprobar la carga externa y la recuperación integral del servicio.</w:t>
       </w:r>
     </w:p>
     <w:p>
@@ -1960,7 +1960,12 @@
     </w:p>
     <w:p>
       <w:r>
-        <w:t>Alcance: no incluye sesiones, tokens de renovación, MFA, configuración de proveedores ni secretos del despliegue. Storage estaba vacío. La prueba no reconstruye todo el servicio Supabase. El plan Free no ofrece copias administradas: el titular debe conservar una copia externa privada y organizar la frecuencia diaria. La ubicación y el procedimiento están en README; nunca adjuntar los datos de Auth al documento académico.</w:t>
+        <w:t>La tarea diaria de Codex está activa a las 09:00 de Paraguay y requiere PC encendida, Codex abierto y Chrome conectado. La primera carga al Drive privado de Ciendel está pendiente del permiso de archivos de Chrome. Excluye sesiones, tokens, MFA, proveedores y secretos. Storage estaba vacío. No acredita recuperación integral de Supabase. El procedimiento está en README y ADR 014; nunca adjuntar datos de Auth al documento académico.</w:t>
+      </w:r>
+    </w:p>
+    <w:p>
+      <w:r>
+        <w:t>CI conserva un bloqueo de seguridad por braces, una dependencia de desarrollo de ESLint sin parche; el titular rechazó exceptuarla. Las dependencias de producción no presentan alertas. Distinguir este control del resultado de las pruebas funcionales y revisar el parche antes del cierre final.</w:t>
       </w:r>
     </w:p>
     <w:p>
@@ -2309,31 +2314,31 @@
       </w:rPr>
     </w:lvl>
   </w:abstractNum>
-  <w:num w:numId="1" w16cid:durableId="807481348">
+  <w:num w:numId="1" w16cid:durableId="843129630">
     <w:abstractNumId w:val="8"/>
   </w:num>
-  <w:num w:numId="2" w16cid:durableId="1530219158">
+  <w:num w:numId="2" w16cid:durableId="951475360">
     <w:abstractNumId w:val="6"/>
   </w:num>
-  <w:num w:numId="3" w16cid:durableId="1842349345">
+  <w:num w:numId="3" w16cid:durableId="424226394">
     <w:abstractNumId w:val="5"/>
   </w:num>
-  <w:num w:numId="4" w16cid:durableId="1392848420">
+  <w:num w:numId="4" w16cid:durableId="1552960825">
     <w:abstractNumId w:val="4"/>
   </w:num>
-  <w:num w:numId="5" w16cid:durableId="264580025">
+  <w:num w:numId="5" w16cid:durableId="780613526">
     <w:abstractNumId w:val="7"/>
   </w:num>
-  <w:num w:numId="6" w16cid:durableId="1517424863">
+  <w:num w:numId="6" w16cid:durableId="919947204">
     <w:abstractNumId w:val="3"/>
   </w:num>
-  <w:num w:numId="7" w16cid:durableId="589193662">
+  <w:num w:numId="7" w16cid:durableId="195389593">
     <w:abstractNumId w:val="2"/>
   </w:num>
-  <w:num w:numId="8" w16cid:durableId="2069066666">
+  <w:num w:numId="8" w16cid:durableId="1702512989">
     <w:abstractNumId w:val="1"/>
   </w:num>
-  <w:num w:numId="9" w16cid:durableId="229190801">
+  <w:num w:numId="9" w16cid:durableId="581567961">
     <w:abstractNumId w:val="0"/>
   </w:num>
 </w:numbering>

</xml_diff>